<commit_message>
fix: clarify PSQ2 QI methodologies as technique references, not mandates
PDSA (IHI/Minnesota DOH), clinical audit cycle (HQIP/NHS, x2), and the
Donabedian model (CASRAI) were cited with no indication these are
optional methodologies. Added notes clarifying NABH does not mandate
any specific one of these — the requirement is NABH PSQ.2 itself, which
any equivalent structured method can satisfy.

Co-Authored-By: Claude Sonnet 5 <noreply@anthropic.com>
Claude-Session: https://claude.ai/code/session_01TPRLtLhmTCP5z94Q3FiE5v
</commit_message>
<xml_diff>
--- a/policies/build/chapters_v2/PSQ/document/PSQ_Package_v2/PSQ2/SOP_PSQ2_quality_improvement_programme.docx
+++ b/policies/build/chapters_v2/PSQ/document/PSQ_Package_v2/PSQ2/SOP_PSQ2_quality_improvement_programme.docx
@@ -321,42 +321,27 @@
     </w:p>
     <w:p>
       <w:r>
-        <w:t xml:space="preserve">Quality Coordinator: </w:t>
-      </w:r>
-      <w:r>
-        <w:t>leads day-to-day work on this policy and owns the required records.</w:t>
+        <w:t xml:space="preserve">Quality Coordinator: leads day-to-day work on this policy and owns the required records.</w:t>
       </w:r>
     </w:p>
     <w:p>
       <w:r>
-        <w:t xml:space="preserve">Safety/Quality Committee: </w:t>
-      </w:r>
-      <w:r>
-        <w:t>reviews progress on this policy at least monthly and signs off the annual review.</w:t>
+        <w:t xml:space="preserve">Safety/Quality Committee: reviews progress on this policy at least monthly and signs off the annual review.</w:t>
       </w:r>
     </w:p>
     <w:p>
       <w:r>
-        <w:t xml:space="preserve">Department Heads: </w:t>
-      </w:r>
-      <w:r>
-        <w:t>carry out the parts of this policy that apply within their own department.</w:t>
+        <w:t xml:space="preserve">Department Heads: carry out the parts of this policy that apply within their own department.</w:t>
       </w:r>
     </w:p>
     <w:p>
       <w:r>
-        <w:t xml:space="preserve">Medical Superintendent / Governing Body: </w:t>
-      </w:r>
-      <w:r>
-        <w:t>provides resources and reviews outcomes reported to them.</w:t>
+        <w:t xml:space="preserve">Medical Superintendent / Governing Body: provides resources and reviews outcomes reported to them.</w:t>
       </w:r>
     </w:p>
     <w:p>
       <w:r>
-        <w:t xml:space="preserve">All staff in scope: </w:t>
-      </w:r>
-      <w:r>
-        <w:t>follow the steps below and raise any Stop-Work concern immediately, without waiting for permission.</w:t>
+        <w:t xml:space="preserve">All staff in scope: follow the steps below and raise any Stop-Work concern immediately, without waiting for permission.</w:t>
       </w:r>
     </w:p>
     <w:p>
@@ -619,6 +604,14 @@
     </w:p>
     <w:p>
       <w:pPr>
+        <w:pStyle w:val="ListParagraph"/>
+      </w:pPr>
+      <w:r>
+        <w:t>Note: this is an internationally used quality-improvement methodology cited for technique only. NABH does not mandate this specific methodology — the underlying requirement is set by NABH Accreditation Standards for Hospitals, 6th Edition, PSQ.2 itself, which any equivalent structured improvement method may be used to satisfy.</w:t>
+      </w:r>
+    </w:p>
+    <w:p>
+      <w:pPr>
         <w:pStyle w:val="Heading2"/>
       </w:pPr>
       <w:r>
@@ -673,6 +666,14 @@
           <w:t>Healthcare Quality Improvement Partnership. (2021). Clinical audit: A guide for NHS boards and partners.</w:t>
         </w:r>
       </w:hyperlink>
+    </w:p>
+    <w:p>
+      <w:pPr>
+        <w:pStyle w:val="ListParagraph"/>
+      </w:pPr>
+      <w:r>
+        <w:t>Note: this is an internationally used quality-improvement methodology cited for technique only. NABH does not mandate this specific methodology — the underlying requirement is set by NABH Accreditation Standards for Hospitals, 6th Edition, PSQ.2 itself, which any equivalent structured improvement method may be used to satisfy.</w:t>
+      </w:r>
     </w:p>
     <w:p>
       <w:pPr>
@@ -888,6 +889,14 @@
     </w:p>
     <w:p>
       <w:pPr>
+        <w:pStyle w:val="ListParagraph"/>
+      </w:pPr>
+      <w:r>
+        <w:t>Note: this is an internationally used quality-improvement methodology cited for technique only. NABH does not mandate this specific methodology — the underlying requirement is set by NABH Accreditation Standards for Hospitals, 6th Edition, PSQ.2 itself, which any equivalent structured improvement method may be used to satisfy.</w:t>
+      </w:r>
+    </w:p>
+    <w:p>
+      <w:pPr>
         <w:pStyle w:val="Heading2"/>
       </w:pPr>
       <w:r>
@@ -942,6 +951,14 @@
           <w:t>CASRAI. (n.d.). Donabedian model: Structure, process, outcome.</w:t>
         </w:r>
       </w:hyperlink>
+    </w:p>
+    <w:p>
+      <w:pPr>
+        <w:pStyle w:val="ListParagraph"/>
+      </w:pPr>
+      <w:r>
+        <w:t>Note: this is an internationally used quality-measurement model cited for framework only. NABH does not mandate this specific model — the underlying requirement is set by NABH Accreditation Standards for Hospitals, 6th Edition, PSQ.2 itself.</w:t>
+      </w:r>
     </w:p>
     <w:p>
       <w:pPr>

</xml_diff>